<commit_message>
added xp and other stuff
</commit_message>
<xml_diff>
--- a/docs/Class Doc.docx
+++ b/docs/Class Doc.docx
@@ -44,15 +44,7 @@
           <w:sz w:val="32"/>
           <w:szCs w:val="32"/>
         </w:rPr>
-        <w:t>Blood Sorcerer</w:t>
-      </w:r>
-      <w:r>
-        <w:rPr>
-          <w:rFonts w:ascii="ALAGARD" w:hAnsi="ALAGARD" w:cs="Calibri"/>
-          <w:sz w:val="32"/>
-          <w:szCs w:val="32"/>
-        </w:rPr>
-        <w:t xml:space="preserve"> Tree</w:t>
+        <w:t>Blood Sorcerer Tree</w:t>
       </w:r>
     </w:p>
     <w:p>
@@ -145,17 +137,8 @@
           <w:rFonts w:ascii="ALAGARD" w:hAnsi="ALAGARD" w:cs="Calibri"/>
           <w:color w:val="000000"/>
         </w:rPr>
-        <w:t xml:space="preserve">- Close to </w:t>
-      </w:r>
-      <w:proofErr w:type="spellStart"/>
-      <w:r>
-        <w:rPr>
-          <w:rFonts w:ascii="ALAGARD" w:hAnsi="ALAGARD" w:cs="Calibri"/>
-          <w:color w:val="000000"/>
-        </w:rPr>
-        <w:t>mid range</w:t>
-      </w:r>
-      <w:proofErr w:type="spellEnd"/>
+        <w:t>- Close to mid range</w:t>
+      </w:r>
     </w:p>
     <w:p>
       <w:pPr>
@@ -172,13 +155,6 @@
         </w:rPr>
         <w:t>- Self Buff</w:t>
       </w:r>
-      <w:r>
-        <w:rPr>
-          <w:rFonts w:ascii="Cambria" w:hAnsi="Cambria" w:cs="Cambria"/>
-          <w:color w:val="000000"/>
-        </w:rPr>
-        <w:t> </w:t>
-      </w:r>
     </w:p>
     <w:p>
       <w:pPr>
@@ -240,49 +216,23 @@
         <w:rPr>
           <w:rFonts w:ascii="ALAGARD" w:hAnsi="ALAGARD" w:cs="Calibri"/>
         </w:rPr>
-        <w:t xml:space="preserve">Blood </w:t>
-      </w:r>
-      <w:r>
-        <w:rPr>
-          <w:rFonts w:ascii="ALAGARD" w:hAnsi="ALAGARD" w:cs="Calibri"/>
-        </w:rPr>
-        <w:t>Queen</w:t>
-      </w:r>
-      <w:r>
-        <w:rPr>
-          <w:rFonts w:ascii="ALAGARD" w:hAnsi="ALAGARD" w:cs="Calibri"/>
-        </w:rPr>
-        <w:t>:</w:t>
-      </w:r>
-    </w:p>
-    <w:p>
-      <w:pPr>
-        <w:shd w:val="clear" w:color="auto" w:fill="FFFFFF"/>
-        <w:rPr>
-          <w:rFonts w:ascii="ALAGARD" w:hAnsi="ALAGARD" w:cs="Calibri"/>
-          <w:color w:val="000000"/>
-        </w:rPr>
-      </w:pPr>
-      <w:r>
-        <w:rPr>
-          <w:rFonts w:ascii="ALAGARD" w:hAnsi="ALAGARD" w:cs="Calibri"/>
-          <w:color w:val="000000"/>
-        </w:rPr>
-        <w:t>Uses blood from corpses or living to create</w:t>
-      </w:r>
-      <w:r>
-        <w:rPr>
-          <w:rFonts w:ascii="ALAGARD" w:hAnsi="ALAGARD" w:cs="Calibri"/>
-          <w:color w:val="000000"/>
-        </w:rPr>
-        <w:t xml:space="preserve"> </w:t>
-      </w:r>
-      <w:r>
-        <w:rPr>
-          <w:rFonts w:ascii="ALAGARD" w:hAnsi="ALAGARD" w:cs="Calibri"/>
-          <w:color w:val="000000"/>
-        </w:rPr>
-        <w:t>minions and cast spells.</w:t>
+        <w:t>Blood Queen:</w:t>
+      </w:r>
+    </w:p>
+    <w:p>
+      <w:pPr>
+        <w:shd w:val="clear" w:color="auto" w:fill="FFFFFF"/>
+        <w:rPr>
+          <w:rFonts w:ascii="ALAGARD" w:hAnsi="ALAGARD" w:cs="Calibri"/>
+          <w:color w:val="000000"/>
+        </w:rPr>
+      </w:pPr>
+      <w:r>
+        <w:rPr>
+          <w:rFonts w:ascii="ALAGARD" w:hAnsi="ALAGARD" w:cs="Calibri"/>
+          <w:color w:val="000000"/>
+        </w:rPr>
+        <w:t>Uses blood from corpses or living to create minions and cast spells.</w:t>
       </w:r>
       <w:r>
         <w:rPr>
@@ -687,41 +637,27 @@
           <w:sz w:val="32"/>
           <w:szCs w:val="32"/>
         </w:rPr>
-        <w:t>Dark Sage</w:t>
-      </w:r>
-      <w:r>
-        <w:rPr>
-          <w:rFonts w:ascii="ALAGARD" w:hAnsi="ALAGARD" w:cs="Calibri"/>
-          <w:sz w:val="32"/>
-          <w:szCs w:val="32"/>
-        </w:rPr>
-        <w:t xml:space="preserve"> Tree</w:t>
-      </w:r>
-    </w:p>
-    <w:p>
-      <w:pPr>
-        <w:rPr>
-          <w:rFonts w:ascii="ALAGARD" w:hAnsi="ALAGARD" w:cs="Calibri"/>
-        </w:rPr>
-      </w:pPr>
-    </w:p>
-    <w:p>
-      <w:pPr>
-        <w:rPr>
-          <w:rFonts w:ascii="ALAGARD" w:hAnsi="ALAGARD" w:cs="Calibri"/>
-        </w:rPr>
-      </w:pPr>
-      <w:r>
-        <w:rPr>
-          <w:rFonts w:ascii="ALAGARD" w:hAnsi="ALAGARD" w:cs="Calibri"/>
-        </w:rPr>
-        <w:t>Deviled Tongue</w:t>
-      </w:r>
-      <w:r>
-        <w:rPr>
-          <w:rFonts w:ascii="ALAGARD" w:hAnsi="ALAGARD" w:cs="Calibri"/>
-        </w:rPr>
-        <w:t>:</w:t>
+        <w:t>Dark Sage Tree</w:t>
+      </w:r>
+    </w:p>
+    <w:p>
+      <w:pPr>
+        <w:rPr>
+          <w:rFonts w:ascii="ALAGARD" w:hAnsi="ALAGARD" w:cs="Calibri"/>
+        </w:rPr>
+      </w:pPr>
+    </w:p>
+    <w:p>
+      <w:pPr>
+        <w:rPr>
+          <w:rFonts w:ascii="ALAGARD" w:hAnsi="ALAGARD" w:cs="Calibri"/>
+        </w:rPr>
+      </w:pPr>
+      <w:r>
+        <w:rPr>
+          <w:rFonts w:ascii="ALAGARD" w:hAnsi="ALAGARD" w:cs="Calibri"/>
+        </w:rPr>
+        <w:t>Deviled Tongue:</w:t>
       </w:r>
     </w:p>
     <w:p>
@@ -917,13 +853,7 @@
         <w:rPr>
           <w:rFonts w:ascii="ALAGARD" w:hAnsi="ALAGARD" w:cs="Calibri"/>
         </w:rPr>
-        <w:t>Maledictor</w:t>
-      </w:r>
-      <w:r>
-        <w:rPr>
-          <w:rFonts w:ascii="ALAGARD" w:hAnsi="ALAGARD" w:cs="Calibri"/>
-        </w:rPr>
-        <w:t>:</w:t>
+        <w:t>Maledictor:</w:t>
       </w:r>
     </w:p>
     <w:p>
@@ -1102,733 +1032,697 @@
           <w:sz w:val="32"/>
           <w:szCs w:val="32"/>
         </w:rPr>
-        <w:t>Sorcerer</w:t>
-      </w:r>
-      <w:r>
+        <w:t>Sorcerer Tree</w:t>
+      </w:r>
+    </w:p>
+    <w:p>
+      <w:pPr>
+        <w:rPr>
+          <w:rFonts w:ascii="ALAGARD" w:hAnsi="ALAGARD" w:cs="Calibri"/>
+        </w:rPr>
+      </w:pPr>
+    </w:p>
+    <w:p>
+      <w:pPr>
+        <w:rPr>
+          <w:rFonts w:ascii="ALAGARD" w:hAnsi="ALAGARD" w:cs="Calibri"/>
+        </w:rPr>
+      </w:pPr>
+      <w:proofErr w:type="spellStart"/>
+      <w:r>
+        <w:rPr>
+          <w:rFonts w:ascii="ALAGARD" w:hAnsi="ALAGARD" w:cs="Calibri"/>
+        </w:rPr>
+        <w:t>Orumansa</w:t>
+      </w:r>
+      <w:proofErr w:type="spellEnd"/>
+      <w:r>
+        <w:rPr>
+          <w:rFonts w:ascii="ALAGARD" w:hAnsi="ALAGARD" w:cs="Calibri"/>
+        </w:rPr>
+        <w:t>:</w:t>
+      </w:r>
+    </w:p>
+    <w:p>
+      <w:pPr>
+        <w:rPr>
+          <w:rFonts w:ascii="ALAGARD" w:hAnsi="ALAGARD" w:cs="Calibri"/>
+        </w:rPr>
+      </w:pPr>
+      <w:r>
+        <w:rPr>
+          <w:rFonts w:ascii="ALAGARD" w:hAnsi="ALAGARD" w:cs="Calibri"/>
+          <w:color w:val="000000"/>
+          <w:shd w:val="clear" w:color="auto" w:fill="FFFFFF"/>
+        </w:rPr>
+        <w:t xml:space="preserve">Translated to </w:t>
+      </w:r>
+      <w:proofErr w:type="spellStart"/>
+      <w:r>
+        <w:rPr>
+          <w:rFonts w:ascii="ALAGARD" w:hAnsi="ALAGARD" w:cs="Calibri"/>
+          <w:color w:val="000000"/>
+          <w:shd w:val="clear" w:color="auto" w:fill="FFFFFF"/>
+        </w:rPr>
+        <w:t>Allmancer</w:t>
+      </w:r>
+      <w:proofErr w:type="spellEnd"/>
+      <w:r>
+        <w:rPr>
+          <w:rFonts w:ascii="ALAGARD" w:hAnsi="ALAGARD" w:cs="Calibri"/>
+          <w:color w:val="000000"/>
+          <w:shd w:val="clear" w:color="auto" w:fill="FFFFFF"/>
+        </w:rPr>
+        <w:t xml:space="preserve">. </w:t>
+      </w:r>
+      <w:proofErr w:type="gramStart"/>
+      <w:r>
+        <w:rPr>
+          <w:rFonts w:ascii="ALAGARD" w:hAnsi="ALAGARD" w:cs="Calibri"/>
+          <w:color w:val="000000"/>
+          <w:shd w:val="clear" w:color="auto" w:fill="FFFFFF"/>
+        </w:rPr>
+        <w:t>Typical magic</w:t>
+      </w:r>
+      <w:r>
+        <w:rPr>
+          <w:rFonts w:ascii="ALAGARD" w:hAnsi="ALAGARD" w:cs="Calibri"/>
+        </w:rPr>
+        <w:t xml:space="preserve"> </w:t>
+      </w:r>
+      <w:r>
+        <w:rPr>
+          <w:rFonts w:ascii="ALAGARD" w:hAnsi="ALAGARD" w:cs="Calibri"/>
+          <w:color w:val="000000"/>
+        </w:rPr>
+        <w:t>user,</w:t>
+      </w:r>
+      <w:proofErr w:type="gramEnd"/>
+      <w:r>
+        <w:rPr>
+          <w:rFonts w:ascii="ALAGARD" w:hAnsi="ALAGARD" w:cs="Calibri"/>
+          <w:color w:val="000000"/>
+        </w:rPr>
+        <w:t xml:space="preserve"> can cast elemental magics like</w:t>
+      </w:r>
+      <w:r>
+        <w:rPr>
+          <w:rFonts w:ascii="ALAGARD" w:hAnsi="ALAGARD" w:cs="Calibri"/>
+        </w:rPr>
+        <w:t xml:space="preserve"> </w:t>
+      </w:r>
+      <w:r>
+        <w:rPr>
+          <w:rFonts w:ascii="ALAGARD" w:hAnsi="ALAGARD" w:cs="Calibri"/>
+          <w:color w:val="000000"/>
+        </w:rPr>
+        <w:t>earth, fire, ice, wind, water, lightning.</w:t>
+      </w:r>
+    </w:p>
+    <w:p>
+      <w:pPr>
+        <w:shd w:val="clear" w:color="auto" w:fill="FFFFFF"/>
+        <w:rPr>
+          <w:rFonts w:ascii="ALAGARD" w:hAnsi="ALAGARD" w:cs="Calibri"/>
+          <w:color w:val="000000"/>
+        </w:rPr>
+      </w:pPr>
+    </w:p>
+    <w:p>
+      <w:pPr>
+        <w:shd w:val="clear" w:color="auto" w:fill="FFFFFF"/>
+        <w:rPr>
+          <w:rFonts w:ascii="ALAGARD" w:hAnsi="ALAGARD" w:cs="Calibri"/>
+          <w:color w:val="000000"/>
+        </w:rPr>
+      </w:pPr>
+      <w:r>
+        <w:rPr>
+          <w:rFonts w:ascii="ALAGARD" w:hAnsi="ALAGARD" w:cs="Calibri"/>
+          <w:color w:val="000000"/>
+        </w:rPr>
+        <w:t>- close to long range</w:t>
+      </w:r>
+    </w:p>
+    <w:p>
+      <w:pPr>
+        <w:shd w:val="clear" w:color="auto" w:fill="FFFFFF"/>
+        <w:rPr>
+          <w:rFonts w:ascii="ALAGARD" w:hAnsi="ALAGARD" w:cs="Calibri"/>
+          <w:color w:val="000000"/>
+        </w:rPr>
+      </w:pPr>
+      <w:r>
+        <w:rPr>
+          <w:rFonts w:ascii="ALAGARD" w:hAnsi="ALAGARD" w:cs="Calibri"/>
+          <w:color w:val="000000"/>
+        </w:rPr>
+        <w:t>- uses decent magic</w:t>
+      </w:r>
+    </w:p>
+    <w:p>
+      <w:pPr>
+        <w:shd w:val="clear" w:color="auto" w:fill="FFFFFF"/>
+        <w:rPr>
+          <w:rFonts w:ascii="ALAGARD" w:hAnsi="ALAGARD" w:cs="Calibri"/>
+          <w:color w:val="000000"/>
+        </w:rPr>
+      </w:pPr>
+      <w:r>
+        <w:rPr>
+          <w:rFonts w:ascii="ALAGARD" w:hAnsi="ALAGARD" w:cs="Calibri"/>
+          <w:color w:val="000000"/>
+        </w:rPr>
+        <w:t>- elemental damage</w:t>
+      </w:r>
+    </w:p>
+    <w:p>
+      <w:pPr>
+        <w:shd w:val="clear" w:color="auto" w:fill="FFFFFF"/>
+        <w:rPr>
+          <w:rFonts w:ascii="ALAGARD" w:hAnsi="ALAGARD" w:cs="Calibri"/>
+          <w:color w:val="000000"/>
+        </w:rPr>
+      </w:pPr>
+      <w:r>
+        <w:rPr>
+          <w:rFonts w:ascii="ALAGARD" w:hAnsi="ALAGARD" w:cs="Calibri"/>
+          <w:color w:val="000000"/>
+        </w:rPr>
+        <w:t>- has elemental resistances</w:t>
+      </w:r>
+    </w:p>
+    <w:p>
+      <w:pPr>
+        <w:rPr>
+          <w:rFonts w:ascii="ALAGARD" w:hAnsi="ALAGARD" w:cs="Calibri"/>
+        </w:rPr>
+      </w:pPr>
+    </w:p>
+    <w:p>
+      <w:pPr>
+        <w:rPr>
+          <w:rFonts w:ascii="ALAGARD" w:hAnsi="ALAGARD" w:cs="Calibri"/>
+        </w:rPr>
+      </w:pPr>
+      <w:proofErr w:type="spellStart"/>
+      <w:r>
+        <w:rPr>
+          <w:rFonts w:ascii="ALAGARD" w:hAnsi="ALAGARD" w:cs="Calibri"/>
+        </w:rPr>
+        <w:t>Dragonian</w:t>
+      </w:r>
+      <w:proofErr w:type="spellEnd"/>
+      <w:r>
+        <w:rPr>
+          <w:rFonts w:ascii="ALAGARD" w:hAnsi="ALAGARD" w:cs="Calibri"/>
+        </w:rPr>
+        <w:t>:</w:t>
+      </w:r>
+    </w:p>
+    <w:p>
+      <w:pPr>
+        <w:rPr>
+          <w:rFonts w:ascii="ALAGARD" w:hAnsi="ALAGARD" w:cs="Calibri"/>
+        </w:rPr>
+      </w:pPr>
+      <w:r>
+        <w:rPr>
+          <w:rFonts w:ascii="ALAGARD" w:hAnsi="ALAGARD" w:cs="Calibri"/>
+          <w:color w:val="000000"/>
+          <w:shd w:val="clear" w:color="auto" w:fill="FFFFFF"/>
+        </w:rPr>
+        <w:t>Dragon born class. Can use the power of dragons.</w:t>
+      </w:r>
+      <w:r>
+        <w:rPr>
+          <w:rFonts w:ascii="ALAGARD" w:hAnsi="ALAGARD" w:cs="Calibri"/>
+        </w:rPr>
+        <w:t xml:space="preserve"> </w:t>
+      </w:r>
+      <w:r>
+        <w:rPr>
+          <w:rFonts w:ascii="ALAGARD" w:hAnsi="ALAGARD" w:cs="Calibri"/>
+          <w:color w:val="000000"/>
+        </w:rPr>
+        <w:t xml:space="preserve">can cast </w:t>
+      </w:r>
+      <w:proofErr w:type="spellStart"/>
+      <w:r>
+        <w:rPr>
+          <w:rFonts w:ascii="ALAGARD" w:hAnsi="ALAGARD" w:cs="Calibri"/>
+          <w:color w:val="000000"/>
+        </w:rPr>
+        <w:t>dragonian</w:t>
+      </w:r>
+      <w:proofErr w:type="spellEnd"/>
+      <w:r>
+        <w:rPr>
+          <w:rFonts w:ascii="ALAGARD" w:hAnsi="ALAGARD" w:cs="Calibri"/>
+          <w:color w:val="000000"/>
+        </w:rPr>
+        <w:t xml:space="preserve"> spells like dragon fire breath,</w:t>
+      </w:r>
+      <w:r>
+        <w:rPr>
+          <w:rFonts w:ascii="ALAGARD" w:hAnsi="ALAGARD" w:cs="Calibri"/>
+        </w:rPr>
+        <w:t xml:space="preserve"> </w:t>
+      </w:r>
+      <w:r>
+        <w:rPr>
+          <w:rFonts w:ascii="ALAGARD" w:hAnsi="ALAGARD" w:cs="Calibri"/>
+          <w:color w:val="000000"/>
+        </w:rPr>
+        <w:t>can transform into a dragon/human hybrid</w:t>
+      </w:r>
+      <w:r>
+        <w:rPr>
+          <w:rFonts w:ascii="ALAGARD" w:hAnsi="ALAGARD" w:cs="Calibri"/>
+        </w:rPr>
+        <w:t xml:space="preserve"> </w:t>
+      </w:r>
+      <w:proofErr w:type="gramStart"/>
+      <w:r>
+        <w:rPr>
+          <w:rFonts w:ascii="ALAGARD" w:hAnsi="ALAGARD" w:cs="Calibri"/>
+          <w:color w:val="000000"/>
+        </w:rPr>
+        <w:t>and also</w:t>
+      </w:r>
+      <w:proofErr w:type="gramEnd"/>
+      <w:r>
+        <w:rPr>
+          <w:rFonts w:ascii="ALAGARD" w:hAnsi="ALAGARD" w:cs="Calibri"/>
+          <w:color w:val="000000"/>
+        </w:rPr>
+        <w:t xml:space="preserve"> a full transformation into a dragon.</w:t>
+      </w:r>
+    </w:p>
+    <w:p>
+      <w:pPr>
+        <w:shd w:val="clear" w:color="auto" w:fill="FFFFFF"/>
+        <w:rPr>
+          <w:rFonts w:ascii="ALAGARD" w:hAnsi="ALAGARD" w:cs="Calibri"/>
+          <w:color w:val="000000"/>
+        </w:rPr>
+      </w:pPr>
+    </w:p>
+    <w:p>
+      <w:pPr>
+        <w:shd w:val="clear" w:color="auto" w:fill="FFFFFF"/>
+        <w:rPr>
+          <w:rFonts w:ascii="ALAGARD" w:hAnsi="ALAGARD" w:cs="Calibri"/>
+          <w:color w:val="000000"/>
+        </w:rPr>
+      </w:pPr>
+      <w:r>
+        <w:rPr>
+          <w:rFonts w:ascii="ALAGARD" w:hAnsi="ALAGARD" w:cs="Calibri"/>
+          <w:color w:val="000000"/>
+        </w:rPr>
+        <w:t>- uses mana to stay in draconic form</w:t>
+      </w:r>
+    </w:p>
+    <w:p>
+      <w:pPr>
+        <w:shd w:val="clear" w:color="auto" w:fill="FFFFFF"/>
+        <w:rPr>
+          <w:rFonts w:ascii="ALAGARD" w:hAnsi="ALAGARD" w:cs="Calibri"/>
+          <w:color w:val="000000"/>
+        </w:rPr>
+      </w:pPr>
+      <w:r>
+        <w:rPr>
+          <w:rFonts w:ascii="ALAGARD" w:hAnsi="ALAGARD" w:cs="Calibri"/>
+          <w:color w:val="000000"/>
+        </w:rPr>
+        <w:t xml:space="preserve">- close to </w:t>
+      </w:r>
+      <w:proofErr w:type="spellStart"/>
+      <w:r>
+        <w:rPr>
+          <w:rFonts w:ascii="ALAGARD" w:hAnsi="ALAGARD" w:cs="Calibri"/>
+          <w:color w:val="000000"/>
+        </w:rPr>
+        <w:t>mid range</w:t>
+      </w:r>
+      <w:proofErr w:type="spellEnd"/>
+    </w:p>
+    <w:p>
+      <w:pPr>
+        <w:shd w:val="clear" w:color="auto" w:fill="FFFFFF"/>
+        <w:rPr>
+          <w:rFonts w:ascii="ALAGARD" w:hAnsi="ALAGARD" w:cs="Calibri"/>
+          <w:color w:val="000000"/>
+        </w:rPr>
+      </w:pPr>
+      <w:r>
+        <w:rPr>
+          <w:rFonts w:ascii="ALAGARD" w:hAnsi="ALAGARD" w:cs="Calibri"/>
+          <w:color w:val="000000"/>
+        </w:rPr>
+        <w:t>- high speed, mid damage in hybrid form</w:t>
+      </w:r>
+    </w:p>
+    <w:p>
+      <w:pPr>
+        <w:shd w:val="clear" w:color="auto" w:fill="FFFFFF"/>
+        <w:rPr>
+          <w:rFonts w:ascii="ALAGARD" w:hAnsi="ALAGARD" w:cs="Calibri"/>
+          <w:color w:val="000000"/>
+        </w:rPr>
+      </w:pPr>
+      <w:r>
+        <w:rPr>
+          <w:rFonts w:ascii="ALAGARD" w:hAnsi="ALAGARD" w:cs="Calibri"/>
+          <w:color w:val="000000"/>
+        </w:rPr>
+        <w:t>- low speed, high damage in dragon form</w:t>
+      </w:r>
+    </w:p>
+    <w:p>
+      <w:pPr>
+        <w:shd w:val="clear" w:color="auto" w:fill="FFFFFF"/>
+        <w:rPr>
+          <w:rFonts w:ascii="ALAGARD" w:hAnsi="ALAGARD" w:cs="Calibri"/>
+          <w:color w:val="000000"/>
+        </w:rPr>
+      </w:pPr>
+      <w:r>
+        <w:rPr>
+          <w:rFonts w:ascii="ALAGARD" w:hAnsi="ALAGARD" w:cs="Calibri"/>
+          <w:color w:val="000000"/>
+        </w:rPr>
+        <w:t>- use dragon fire spells</w:t>
+      </w:r>
+    </w:p>
+    <w:p>
+      <w:pPr>
+        <w:shd w:val="clear" w:color="auto" w:fill="FFFFFF"/>
+        <w:rPr>
+          <w:rFonts w:ascii="ALAGARD" w:hAnsi="ALAGARD" w:cs="Calibri"/>
+          <w:color w:val="000000"/>
+        </w:rPr>
+      </w:pPr>
+      <w:r>
+        <w:rPr>
+          <w:rFonts w:ascii="ALAGARD" w:hAnsi="ALAGARD" w:cs="Calibri"/>
+          <w:color w:val="000000"/>
+        </w:rPr>
+        <w:t>- 60% resistant to fire in hybrid form</w:t>
+      </w:r>
+    </w:p>
+    <w:p>
+      <w:pPr>
+        <w:shd w:val="clear" w:color="auto" w:fill="FFFFFF"/>
+        <w:rPr>
+          <w:rFonts w:ascii="ALAGARD" w:hAnsi="ALAGARD" w:cs="Calibri"/>
+          <w:color w:val="000000"/>
+        </w:rPr>
+      </w:pPr>
+      <w:r>
+        <w:rPr>
+          <w:rFonts w:ascii="ALAGARD" w:hAnsi="ALAGARD" w:cs="Calibri"/>
+          <w:color w:val="000000"/>
+        </w:rPr>
+        <w:t>- nullification to fire in dragon form</w:t>
+      </w:r>
+    </w:p>
+    <w:p>
+      <w:pPr>
+        <w:shd w:val="clear" w:color="auto" w:fill="FFFFFF"/>
+        <w:rPr>
+          <w:rFonts w:ascii="ALAGARD" w:hAnsi="ALAGARD" w:cs="Calibri"/>
+          <w:color w:val="000000"/>
+        </w:rPr>
+      </w:pPr>
+      <w:r>
+        <w:rPr>
+          <w:rFonts w:ascii="ALAGARD" w:hAnsi="ALAGARD" w:cs="Calibri"/>
+          <w:color w:val="000000"/>
+        </w:rPr>
+        <w:t>- 30% resistant to fire in human form</w:t>
+      </w:r>
+    </w:p>
+    <w:p>
+      <w:pPr>
+        <w:rPr>
+          <w:rFonts w:ascii="ALAGARD" w:hAnsi="ALAGARD" w:cs="Calibri"/>
+        </w:rPr>
+      </w:pPr>
+    </w:p>
+    <w:p>
+      <w:pPr>
+        <w:rPr>
+          <w:rFonts w:ascii="ALAGARD" w:hAnsi="ALAGARD" w:cs="Calibri"/>
+        </w:rPr>
+      </w:pPr>
+    </w:p>
+    <w:p>
+      <w:pPr>
         <w:rPr>
           <w:rFonts w:ascii="ALAGARD" w:hAnsi="ALAGARD" w:cs="Calibri"/>
           <w:sz w:val="32"/>
           <w:szCs w:val="32"/>
         </w:rPr>
-        <w:t xml:space="preserve"> Tree</w:t>
-      </w:r>
-    </w:p>
-    <w:p>
-      <w:pPr>
-        <w:rPr>
-          <w:rFonts w:ascii="ALAGARD" w:hAnsi="ALAGARD" w:cs="Calibri"/>
-        </w:rPr>
-      </w:pPr>
-    </w:p>
-    <w:p>
-      <w:pPr>
-        <w:rPr>
-          <w:rFonts w:ascii="ALAGARD" w:hAnsi="ALAGARD" w:cs="Calibri"/>
-        </w:rPr>
-      </w:pPr>
-      <w:proofErr w:type="spellStart"/>
-      <w:r>
-        <w:rPr>
-          <w:rFonts w:ascii="ALAGARD" w:hAnsi="ALAGARD" w:cs="Calibri"/>
-        </w:rPr>
-        <w:t>Orumansa</w:t>
-      </w:r>
-      <w:proofErr w:type="spellEnd"/>
-      <w:r>
-        <w:rPr>
-          <w:rFonts w:ascii="ALAGARD" w:hAnsi="ALAGARD" w:cs="Calibri"/>
-        </w:rPr>
-        <w:t>:</w:t>
-      </w:r>
-    </w:p>
-    <w:p>
-      <w:pPr>
-        <w:rPr>
-          <w:rFonts w:ascii="ALAGARD" w:hAnsi="ALAGARD" w:cs="Calibri"/>
-        </w:rPr>
-      </w:pPr>
-      <w:r>
-        <w:rPr>
-          <w:rFonts w:ascii="ALAGARD" w:hAnsi="ALAGARD" w:cs="Calibri"/>
-          <w:color w:val="000000"/>
-          <w:shd w:val="clear" w:color="auto" w:fill="FFFFFF"/>
-        </w:rPr>
-        <w:t xml:space="preserve">Translated to </w:t>
-      </w:r>
-      <w:proofErr w:type="spellStart"/>
-      <w:r>
-        <w:rPr>
-          <w:rFonts w:ascii="ALAGARD" w:hAnsi="ALAGARD" w:cs="Calibri"/>
-          <w:color w:val="000000"/>
-          <w:shd w:val="clear" w:color="auto" w:fill="FFFFFF"/>
-        </w:rPr>
-        <w:t>Allmancer</w:t>
-      </w:r>
-      <w:proofErr w:type="spellEnd"/>
-      <w:r>
-        <w:rPr>
-          <w:rFonts w:ascii="ALAGARD" w:hAnsi="ALAGARD" w:cs="Calibri"/>
-          <w:color w:val="000000"/>
-          <w:shd w:val="clear" w:color="auto" w:fill="FFFFFF"/>
-        </w:rPr>
-        <w:t xml:space="preserve">. </w:t>
-      </w:r>
-      <w:proofErr w:type="gramStart"/>
-      <w:r>
-        <w:rPr>
-          <w:rFonts w:ascii="ALAGARD" w:hAnsi="ALAGARD" w:cs="Calibri"/>
-          <w:color w:val="000000"/>
-          <w:shd w:val="clear" w:color="auto" w:fill="FFFFFF"/>
-        </w:rPr>
-        <w:t>Typical magic</w:t>
-      </w:r>
-      <w:r>
-        <w:rPr>
-          <w:rFonts w:ascii="ALAGARD" w:hAnsi="ALAGARD" w:cs="Calibri"/>
-        </w:rPr>
-        <w:t xml:space="preserve"> </w:t>
-      </w:r>
-      <w:r>
-        <w:rPr>
-          <w:rFonts w:ascii="ALAGARD" w:hAnsi="ALAGARD" w:cs="Calibri"/>
-          <w:color w:val="000000"/>
-        </w:rPr>
-        <w:t>user,</w:t>
-      </w:r>
-      <w:proofErr w:type="gramEnd"/>
-      <w:r>
-        <w:rPr>
-          <w:rFonts w:ascii="ALAGARD" w:hAnsi="ALAGARD" w:cs="Calibri"/>
-          <w:color w:val="000000"/>
-        </w:rPr>
-        <w:t xml:space="preserve"> can cast elemental magics like</w:t>
-      </w:r>
-      <w:r>
-        <w:rPr>
-          <w:rFonts w:ascii="ALAGARD" w:hAnsi="ALAGARD" w:cs="Calibri"/>
-        </w:rPr>
-        <w:t xml:space="preserve"> </w:t>
-      </w:r>
-      <w:r>
-        <w:rPr>
-          <w:rFonts w:ascii="ALAGARD" w:hAnsi="ALAGARD" w:cs="Calibri"/>
-          <w:color w:val="000000"/>
-        </w:rPr>
-        <w:t>earth, fire, ice, wind, water, lightning.</w:t>
-      </w:r>
-    </w:p>
-    <w:p>
-      <w:pPr>
-        <w:shd w:val="clear" w:color="auto" w:fill="FFFFFF"/>
-        <w:rPr>
-          <w:rFonts w:ascii="ALAGARD" w:hAnsi="ALAGARD" w:cs="Calibri"/>
-          <w:color w:val="000000"/>
-        </w:rPr>
-      </w:pPr>
-    </w:p>
-    <w:p>
-      <w:pPr>
-        <w:shd w:val="clear" w:color="auto" w:fill="FFFFFF"/>
-        <w:rPr>
-          <w:rFonts w:ascii="ALAGARD" w:hAnsi="ALAGARD" w:cs="Calibri"/>
-          <w:color w:val="000000"/>
-        </w:rPr>
-      </w:pPr>
-      <w:r>
-        <w:rPr>
-          <w:rFonts w:ascii="ALAGARD" w:hAnsi="ALAGARD" w:cs="Calibri"/>
-          <w:color w:val="000000"/>
-        </w:rPr>
-        <w:t>- close to long range</w:t>
-      </w:r>
-    </w:p>
-    <w:p>
-      <w:pPr>
-        <w:shd w:val="clear" w:color="auto" w:fill="FFFFFF"/>
-        <w:rPr>
-          <w:rFonts w:ascii="ALAGARD" w:hAnsi="ALAGARD" w:cs="Calibri"/>
-          <w:color w:val="000000"/>
-        </w:rPr>
-      </w:pPr>
-      <w:r>
-        <w:rPr>
-          <w:rFonts w:ascii="ALAGARD" w:hAnsi="ALAGARD" w:cs="Calibri"/>
-          <w:color w:val="000000"/>
-        </w:rPr>
-        <w:t>- uses decent magic</w:t>
-      </w:r>
-    </w:p>
-    <w:p>
-      <w:pPr>
-        <w:shd w:val="clear" w:color="auto" w:fill="FFFFFF"/>
-        <w:rPr>
-          <w:rFonts w:ascii="ALAGARD" w:hAnsi="ALAGARD" w:cs="Calibri"/>
-          <w:color w:val="000000"/>
-        </w:rPr>
-      </w:pPr>
-      <w:r>
-        <w:rPr>
-          <w:rFonts w:ascii="ALAGARD" w:hAnsi="ALAGARD" w:cs="Calibri"/>
-          <w:color w:val="000000"/>
-        </w:rPr>
-        <w:t>- elemental damage</w:t>
-      </w:r>
-    </w:p>
-    <w:p>
-      <w:pPr>
-        <w:shd w:val="clear" w:color="auto" w:fill="FFFFFF"/>
-        <w:rPr>
-          <w:rFonts w:ascii="ALAGARD" w:hAnsi="ALAGARD" w:cs="Calibri"/>
-          <w:color w:val="000000"/>
-        </w:rPr>
-      </w:pPr>
-      <w:r>
-        <w:rPr>
-          <w:rFonts w:ascii="ALAGARD" w:hAnsi="ALAGARD" w:cs="Calibri"/>
-          <w:color w:val="000000"/>
-        </w:rPr>
-        <w:t>- has elemental resistances</w:t>
-      </w:r>
-    </w:p>
-    <w:p>
-      <w:pPr>
-        <w:rPr>
-          <w:rFonts w:ascii="ALAGARD" w:hAnsi="ALAGARD" w:cs="Calibri"/>
-        </w:rPr>
-      </w:pPr>
-    </w:p>
-    <w:p>
-      <w:pPr>
-        <w:rPr>
-          <w:rFonts w:ascii="ALAGARD" w:hAnsi="ALAGARD" w:cs="Calibri"/>
-        </w:rPr>
-      </w:pPr>
-      <w:proofErr w:type="spellStart"/>
-      <w:r>
-        <w:rPr>
-          <w:rFonts w:ascii="ALAGARD" w:hAnsi="ALAGARD" w:cs="Calibri"/>
-        </w:rPr>
-        <w:t>Dragonian</w:t>
-      </w:r>
-      <w:proofErr w:type="spellEnd"/>
-      <w:r>
-        <w:rPr>
-          <w:rFonts w:ascii="ALAGARD" w:hAnsi="ALAGARD" w:cs="Calibri"/>
-        </w:rPr>
-        <w:t>:</w:t>
-      </w:r>
-    </w:p>
-    <w:p>
-      <w:pPr>
-        <w:rPr>
-          <w:rFonts w:ascii="ALAGARD" w:hAnsi="ALAGARD" w:cs="Calibri"/>
-        </w:rPr>
-      </w:pPr>
-      <w:r>
-        <w:rPr>
-          <w:rFonts w:ascii="ALAGARD" w:hAnsi="ALAGARD" w:cs="Calibri"/>
-          <w:color w:val="000000"/>
-          <w:shd w:val="clear" w:color="auto" w:fill="FFFFFF"/>
-        </w:rPr>
-        <w:t>Dragon born class. Can use the power of dragons.</w:t>
-      </w:r>
-      <w:r>
-        <w:rPr>
-          <w:rFonts w:ascii="ALAGARD" w:hAnsi="ALAGARD" w:cs="Calibri"/>
-        </w:rPr>
-        <w:t xml:space="preserve"> </w:t>
-      </w:r>
-      <w:r>
-        <w:rPr>
-          <w:rFonts w:ascii="ALAGARD" w:hAnsi="ALAGARD" w:cs="Calibri"/>
-          <w:color w:val="000000"/>
-        </w:rPr>
-        <w:t xml:space="preserve">can cast </w:t>
-      </w:r>
-      <w:proofErr w:type="spellStart"/>
-      <w:r>
-        <w:rPr>
-          <w:rFonts w:ascii="ALAGARD" w:hAnsi="ALAGARD" w:cs="Calibri"/>
-          <w:color w:val="000000"/>
-        </w:rPr>
-        <w:t>dragonian</w:t>
-      </w:r>
-      <w:proofErr w:type="spellEnd"/>
-      <w:r>
-        <w:rPr>
-          <w:rFonts w:ascii="ALAGARD" w:hAnsi="ALAGARD" w:cs="Calibri"/>
-          <w:color w:val="000000"/>
-        </w:rPr>
-        <w:t xml:space="preserve"> spells like dragon fire breath,</w:t>
-      </w:r>
-      <w:r>
-        <w:rPr>
-          <w:rFonts w:ascii="ALAGARD" w:hAnsi="ALAGARD" w:cs="Calibri"/>
-        </w:rPr>
-        <w:t xml:space="preserve"> </w:t>
-      </w:r>
-      <w:r>
-        <w:rPr>
-          <w:rFonts w:ascii="ALAGARD" w:hAnsi="ALAGARD" w:cs="Calibri"/>
-          <w:color w:val="000000"/>
-        </w:rPr>
-        <w:t>can transform into a dragon/human hybrid</w:t>
-      </w:r>
-      <w:r>
-        <w:rPr>
-          <w:rFonts w:ascii="ALAGARD" w:hAnsi="ALAGARD" w:cs="Calibri"/>
-        </w:rPr>
-        <w:t xml:space="preserve"> </w:t>
-      </w:r>
-      <w:proofErr w:type="gramStart"/>
-      <w:r>
-        <w:rPr>
-          <w:rFonts w:ascii="ALAGARD" w:hAnsi="ALAGARD" w:cs="Calibri"/>
-          <w:color w:val="000000"/>
-        </w:rPr>
-        <w:t>and also</w:t>
-      </w:r>
-      <w:proofErr w:type="gramEnd"/>
-      <w:r>
-        <w:rPr>
-          <w:rFonts w:ascii="ALAGARD" w:hAnsi="ALAGARD" w:cs="Calibri"/>
-          <w:color w:val="000000"/>
-        </w:rPr>
-        <w:t xml:space="preserve"> a full transformation into a dragon.</w:t>
-      </w:r>
-    </w:p>
-    <w:p>
-      <w:pPr>
-        <w:shd w:val="clear" w:color="auto" w:fill="FFFFFF"/>
-        <w:rPr>
-          <w:rFonts w:ascii="ALAGARD" w:hAnsi="ALAGARD" w:cs="Calibri"/>
-          <w:color w:val="000000"/>
-        </w:rPr>
-      </w:pPr>
-    </w:p>
-    <w:p>
-      <w:pPr>
-        <w:shd w:val="clear" w:color="auto" w:fill="FFFFFF"/>
-        <w:rPr>
-          <w:rFonts w:ascii="ALAGARD" w:hAnsi="ALAGARD" w:cs="Calibri"/>
-          <w:color w:val="000000"/>
-        </w:rPr>
-      </w:pPr>
-      <w:r>
-        <w:rPr>
-          <w:rFonts w:ascii="ALAGARD" w:hAnsi="ALAGARD" w:cs="Calibri"/>
-          <w:color w:val="000000"/>
-        </w:rPr>
-        <w:t>- uses mana to stay in draconic form</w:t>
-      </w:r>
-    </w:p>
-    <w:p>
-      <w:pPr>
-        <w:shd w:val="clear" w:color="auto" w:fill="FFFFFF"/>
-        <w:rPr>
-          <w:rFonts w:ascii="ALAGARD" w:hAnsi="ALAGARD" w:cs="Calibri"/>
-          <w:color w:val="000000"/>
-        </w:rPr>
-      </w:pPr>
-      <w:r>
-        <w:rPr>
-          <w:rFonts w:ascii="ALAGARD" w:hAnsi="ALAGARD" w:cs="Calibri"/>
-          <w:color w:val="000000"/>
-        </w:rPr>
-        <w:t xml:space="preserve">- close to </w:t>
-      </w:r>
-      <w:proofErr w:type="spellStart"/>
-      <w:r>
-        <w:rPr>
-          <w:rFonts w:ascii="ALAGARD" w:hAnsi="ALAGARD" w:cs="Calibri"/>
-          <w:color w:val="000000"/>
-        </w:rPr>
-        <w:t>mid range</w:t>
-      </w:r>
-      <w:proofErr w:type="spellEnd"/>
-    </w:p>
-    <w:p>
-      <w:pPr>
-        <w:shd w:val="clear" w:color="auto" w:fill="FFFFFF"/>
-        <w:rPr>
-          <w:rFonts w:ascii="ALAGARD" w:hAnsi="ALAGARD" w:cs="Calibri"/>
-          <w:color w:val="000000"/>
-        </w:rPr>
-      </w:pPr>
-      <w:r>
-        <w:rPr>
-          <w:rFonts w:ascii="ALAGARD" w:hAnsi="ALAGARD" w:cs="Calibri"/>
-          <w:color w:val="000000"/>
-        </w:rPr>
-        <w:t>- high speed, mid damage in hybrid form</w:t>
-      </w:r>
-    </w:p>
-    <w:p>
-      <w:pPr>
-        <w:shd w:val="clear" w:color="auto" w:fill="FFFFFF"/>
-        <w:rPr>
-          <w:rFonts w:ascii="ALAGARD" w:hAnsi="ALAGARD" w:cs="Calibri"/>
-          <w:color w:val="000000"/>
-        </w:rPr>
-      </w:pPr>
-      <w:r>
-        <w:rPr>
-          <w:rFonts w:ascii="ALAGARD" w:hAnsi="ALAGARD" w:cs="Calibri"/>
-          <w:color w:val="000000"/>
-        </w:rPr>
-        <w:t>- low speed, high damage in dragon form</w:t>
-      </w:r>
-    </w:p>
-    <w:p>
-      <w:pPr>
-        <w:shd w:val="clear" w:color="auto" w:fill="FFFFFF"/>
-        <w:rPr>
-          <w:rFonts w:ascii="ALAGARD" w:hAnsi="ALAGARD" w:cs="Calibri"/>
-          <w:color w:val="000000"/>
-        </w:rPr>
-      </w:pPr>
-      <w:r>
-        <w:rPr>
-          <w:rFonts w:ascii="ALAGARD" w:hAnsi="ALAGARD" w:cs="Calibri"/>
-          <w:color w:val="000000"/>
-        </w:rPr>
-        <w:t>- use dragon fire spells</w:t>
-      </w:r>
-    </w:p>
-    <w:p>
-      <w:pPr>
-        <w:shd w:val="clear" w:color="auto" w:fill="FFFFFF"/>
-        <w:rPr>
-          <w:rFonts w:ascii="ALAGARD" w:hAnsi="ALAGARD" w:cs="Calibri"/>
-          <w:color w:val="000000"/>
-        </w:rPr>
-      </w:pPr>
-      <w:r>
-        <w:rPr>
-          <w:rFonts w:ascii="ALAGARD" w:hAnsi="ALAGARD" w:cs="Calibri"/>
-          <w:color w:val="000000"/>
-        </w:rPr>
-        <w:t>- 60% resistant to fire in hybrid form</w:t>
-      </w:r>
-    </w:p>
-    <w:p>
-      <w:pPr>
-        <w:shd w:val="clear" w:color="auto" w:fill="FFFFFF"/>
-        <w:rPr>
-          <w:rFonts w:ascii="ALAGARD" w:hAnsi="ALAGARD" w:cs="Calibri"/>
-          <w:color w:val="000000"/>
-        </w:rPr>
-      </w:pPr>
-      <w:r>
-        <w:rPr>
-          <w:rFonts w:ascii="ALAGARD" w:hAnsi="ALAGARD" w:cs="Calibri"/>
-          <w:color w:val="000000"/>
-        </w:rPr>
-        <w:t>- nullification to fire in dragon form</w:t>
-      </w:r>
-    </w:p>
-    <w:p>
-      <w:pPr>
-        <w:shd w:val="clear" w:color="auto" w:fill="FFFFFF"/>
-        <w:rPr>
-          <w:rFonts w:ascii="ALAGARD" w:hAnsi="ALAGARD" w:cs="Calibri"/>
-          <w:color w:val="000000"/>
-        </w:rPr>
-      </w:pPr>
-      <w:r>
-        <w:rPr>
-          <w:rFonts w:ascii="ALAGARD" w:hAnsi="ALAGARD" w:cs="Calibri"/>
-          <w:color w:val="000000"/>
-        </w:rPr>
-        <w:t>- 30% resistant to fire in human form</w:t>
-      </w:r>
-    </w:p>
-    <w:p>
-      <w:pPr>
-        <w:rPr>
-          <w:rFonts w:ascii="ALAGARD" w:hAnsi="ALAGARD" w:cs="Calibri"/>
-        </w:rPr>
-      </w:pPr>
-    </w:p>
-    <w:p>
-      <w:pPr>
-        <w:rPr>
-          <w:rFonts w:ascii="ALAGARD" w:hAnsi="ALAGARD" w:cs="Calibri"/>
-        </w:rPr>
-      </w:pPr>
-    </w:p>
-    <w:p>
-      <w:pPr>
+      </w:pPr>
+      <w:r>
         <w:rPr>
           <w:rFonts w:ascii="ALAGARD" w:hAnsi="ALAGARD" w:cs="Calibri"/>
           <w:sz w:val="32"/>
           <w:szCs w:val="32"/>
         </w:rPr>
-      </w:pPr>
-      <w:r>
+        <w:t>Magus Tree</w:t>
+      </w:r>
+    </w:p>
+    <w:p>
+      <w:pPr>
+        <w:rPr>
+          <w:rFonts w:ascii="ALAGARD" w:hAnsi="ALAGARD" w:cs="Calibri"/>
+        </w:rPr>
+      </w:pPr>
+    </w:p>
+    <w:p>
+      <w:pPr>
+        <w:rPr>
+          <w:rFonts w:ascii="ALAGARD" w:hAnsi="ALAGARD" w:cs="Calibri"/>
+        </w:rPr>
+      </w:pPr>
+      <w:r>
+        <w:rPr>
+          <w:rFonts w:ascii="ALAGARD" w:hAnsi="ALAGARD" w:cs="Calibri"/>
+        </w:rPr>
+        <w:lastRenderedPageBreak/>
+        <w:t>Enchanter:</w:t>
+      </w:r>
+    </w:p>
+    <w:p>
+      <w:pPr>
+        <w:rPr>
+          <w:rFonts w:ascii="ALAGARD" w:hAnsi="ALAGARD" w:cs="Calibri"/>
+        </w:rPr>
+      </w:pPr>
+      <w:r>
+        <w:rPr>
+          <w:rFonts w:ascii="ALAGARD" w:hAnsi="ALAGARD" w:cs="Calibri"/>
+          <w:color w:val="000000"/>
+          <w:shd w:val="clear" w:color="auto" w:fill="FFFFFF"/>
+        </w:rPr>
+        <w:t>Enchanter enchants attributes and abilities and</w:t>
+      </w:r>
+      <w:r>
+        <w:rPr>
+          <w:rFonts w:ascii="ALAGARD" w:hAnsi="ALAGARD" w:cs="Calibri"/>
+        </w:rPr>
+        <w:t xml:space="preserve"> </w:t>
+      </w:r>
+      <w:r>
+        <w:rPr>
+          <w:rFonts w:ascii="ALAGARD" w:hAnsi="ALAGARD" w:cs="Calibri"/>
+          <w:color w:val="000000"/>
+        </w:rPr>
+        <w:t>buffs to self and weapons and armors.</w:t>
+      </w:r>
+      <w:r>
+        <w:rPr>
+          <w:rFonts w:ascii="ALAGARD" w:hAnsi="ALAGARD" w:cs="Calibri"/>
+        </w:rPr>
+        <w:t xml:space="preserve"> </w:t>
+      </w:r>
+      <w:r>
+        <w:rPr>
+          <w:rFonts w:ascii="ALAGARD" w:hAnsi="ALAGARD" w:cs="Calibri"/>
+          <w:color w:val="000000"/>
+        </w:rPr>
+        <w:t>The higher the level of the enchant the more</w:t>
+      </w:r>
+      <w:r>
+        <w:rPr>
+          <w:rFonts w:ascii="ALAGARD" w:hAnsi="ALAGARD" w:cs="Calibri"/>
+        </w:rPr>
+        <w:t xml:space="preserve"> </w:t>
+      </w:r>
+      <w:r>
+        <w:rPr>
+          <w:rFonts w:ascii="ALAGARD" w:hAnsi="ALAGARD" w:cs="Calibri"/>
+          <w:color w:val="000000"/>
+        </w:rPr>
+        <w:t xml:space="preserve">mana you </w:t>
+      </w:r>
+      <w:r>
+        <w:rPr>
+          <w:rFonts w:ascii="ALAGARD" w:hAnsi="ALAGARD" w:cs="Calibri"/>
+          <w:color w:val="000000"/>
+        </w:rPr>
+        <w:t>must</w:t>
+      </w:r>
+      <w:r>
+        <w:rPr>
+          <w:rFonts w:ascii="ALAGARD" w:hAnsi="ALAGARD" w:cs="Calibri"/>
+          <w:color w:val="000000"/>
+        </w:rPr>
+        <w:t xml:space="preserve"> use. Ability enchants cost the</w:t>
+      </w:r>
+      <w:r>
+        <w:rPr>
+          <w:rFonts w:ascii="ALAGARD" w:hAnsi="ALAGARD" w:cs="Calibri"/>
+        </w:rPr>
+        <w:t xml:space="preserve"> </w:t>
+      </w:r>
+      <w:r>
+        <w:rPr>
+          <w:rFonts w:ascii="ALAGARD" w:hAnsi="ALAGARD" w:cs="Calibri"/>
+          <w:color w:val="000000"/>
+        </w:rPr>
+        <w:t>most and you can unlock to enchant spells and</w:t>
+      </w:r>
+      <w:r>
+        <w:rPr>
+          <w:rFonts w:ascii="Cambria" w:hAnsi="Cambria" w:cs="Cambria"/>
+          <w:color w:val="000000"/>
+        </w:rPr>
+        <w:t> </w:t>
+      </w:r>
+      <w:r>
+        <w:rPr>
+          <w:rFonts w:ascii="ALAGARD" w:hAnsi="ALAGARD" w:cs="Calibri"/>
+          <w:color w:val="000000"/>
+        </w:rPr>
+        <w:t>abilities you</w:t>
+      </w:r>
+      <w:r>
+        <w:rPr>
+          <w:rFonts w:ascii="Cambria" w:hAnsi="Cambria" w:cs="Cambria"/>
+          <w:color w:val="000000"/>
+        </w:rPr>
+        <w:t> </w:t>
+      </w:r>
+      <w:r>
+        <w:rPr>
+          <w:rFonts w:ascii="ALAGARD" w:hAnsi="ALAGARD" w:cs="Calibri"/>
+          <w:color w:val="000000"/>
+        </w:rPr>
+        <w:t>already know to your weapon or</w:t>
+      </w:r>
+      <w:r>
+        <w:rPr>
+          <w:rFonts w:ascii="Cambria" w:hAnsi="Cambria" w:cs="Cambria"/>
+          <w:color w:val="000000"/>
+        </w:rPr>
+        <w:t> </w:t>
+      </w:r>
+      <w:r>
+        <w:rPr>
+          <w:rFonts w:ascii="ALAGARD" w:hAnsi="ALAGARD" w:cs="Calibri"/>
+          <w:color w:val="000000"/>
+        </w:rPr>
+        <w:t>from a list of abilities you can learn in the skill tree.</w:t>
+      </w:r>
+    </w:p>
+    <w:p>
+      <w:pPr>
+        <w:shd w:val="clear" w:color="auto" w:fill="FFFFFF"/>
+        <w:rPr>
+          <w:rFonts w:ascii="ALAGARD" w:hAnsi="ALAGARD" w:cs="Calibri"/>
+          <w:color w:val="000000"/>
+        </w:rPr>
+      </w:pPr>
+    </w:p>
+    <w:p>
+      <w:pPr>
+        <w:shd w:val="clear" w:color="auto" w:fill="FFFFFF"/>
+        <w:rPr>
+          <w:rFonts w:ascii="ALAGARD" w:hAnsi="ALAGARD" w:cs="Calibri"/>
+          <w:color w:val="000000"/>
+        </w:rPr>
+      </w:pPr>
+      <w:r>
+        <w:rPr>
+          <w:rFonts w:ascii="ALAGARD" w:hAnsi="ALAGARD" w:cs="Calibri"/>
+          <w:color w:val="000000"/>
+        </w:rPr>
+        <w:t>- close range</w:t>
+      </w:r>
+    </w:p>
+    <w:p>
+      <w:pPr>
+        <w:shd w:val="clear" w:color="auto" w:fill="FFFFFF"/>
+        <w:rPr>
+          <w:rFonts w:ascii="ALAGARD" w:hAnsi="ALAGARD" w:cs="Calibri"/>
+          <w:color w:val="000000"/>
+        </w:rPr>
+      </w:pPr>
+      <w:r>
+        <w:rPr>
+          <w:rFonts w:ascii="ALAGARD" w:hAnsi="ALAGARD" w:cs="Calibri"/>
+          <w:color w:val="000000"/>
+        </w:rPr>
+        <w:t>- uses a lot of mana</w:t>
+      </w:r>
+    </w:p>
+    <w:p>
+      <w:pPr>
+        <w:rPr>
+          <w:rFonts w:ascii="ALAGARD" w:hAnsi="ALAGARD" w:cs="Calibri"/>
+        </w:rPr>
+      </w:pPr>
+    </w:p>
+    <w:p>
+      <w:pPr>
         <w:rPr>
           <w:rFonts w:ascii="ALAGARD" w:hAnsi="ALAGARD" w:cs="Calibri"/>
           <w:sz w:val="32"/>
           <w:szCs w:val="32"/>
         </w:rPr>
-        <w:t>Magus</w:t>
-      </w:r>
+      </w:pPr>
       <w:r>
         <w:rPr>
           <w:rFonts w:ascii="ALAGARD" w:hAnsi="ALAGARD" w:cs="Calibri"/>
           <w:sz w:val="32"/>
           <w:szCs w:val="32"/>
         </w:rPr>
-        <w:t xml:space="preserve"> Tree</w:t>
-      </w:r>
-    </w:p>
-    <w:p>
-      <w:pPr>
-        <w:rPr>
-          <w:rFonts w:ascii="ALAGARD" w:hAnsi="ALAGARD" w:cs="Calibri"/>
-        </w:rPr>
-      </w:pPr>
-    </w:p>
-    <w:p>
-      <w:pPr>
-        <w:rPr>
-          <w:rFonts w:ascii="ALAGARD" w:hAnsi="ALAGARD" w:cs="Calibri"/>
-        </w:rPr>
-      </w:pPr>
-      <w:r>
-        <w:rPr>
-          <w:rFonts w:ascii="ALAGARD" w:hAnsi="ALAGARD" w:cs="Calibri"/>
-        </w:rPr>
-        <w:lastRenderedPageBreak/>
-        <w:t>Enchanter</w:t>
-      </w:r>
-      <w:r>
-        <w:rPr>
-          <w:rFonts w:ascii="ALAGARD" w:hAnsi="ALAGARD" w:cs="Calibri"/>
-        </w:rPr>
-        <w:t>:</w:t>
-      </w:r>
-    </w:p>
-    <w:p>
-      <w:pPr>
-        <w:rPr>
-          <w:rFonts w:ascii="ALAGARD" w:hAnsi="ALAGARD" w:cs="Calibri"/>
-        </w:rPr>
-      </w:pPr>
-      <w:r>
-        <w:rPr>
-          <w:rFonts w:ascii="ALAGARD" w:hAnsi="ALAGARD" w:cs="Calibri"/>
-          <w:color w:val="000000"/>
-          <w:shd w:val="clear" w:color="auto" w:fill="FFFFFF"/>
-        </w:rPr>
-        <w:t>Enchanter enchants attributes and abilities and</w:t>
-      </w:r>
-      <w:r>
-        <w:rPr>
-          <w:rFonts w:ascii="ALAGARD" w:hAnsi="ALAGARD" w:cs="Calibri"/>
-        </w:rPr>
-        <w:t xml:space="preserve"> </w:t>
-      </w:r>
-      <w:r>
-        <w:rPr>
-          <w:rFonts w:ascii="ALAGARD" w:hAnsi="ALAGARD" w:cs="Calibri"/>
-          <w:color w:val="000000"/>
-        </w:rPr>
-        <w:t>buffs to self and weapons and armors.</w:t>
-      </w:r>
-      <w:r>
-        <w:rPr>
-          <w:rFonts w:ascii="ALAGARD" w:hAnsi="ALAGARD" w:cs="Calibri"/>
-        </w:rPr>
-        <w:t xml:space="preserve"> </w:t>
-      </w:r>
-      <w:r>
-        <w:rPr>
-          <w:rFonts w:ascii="ALAGARD" w:hAnsi="ALAGARD" w:cs="Calibri"/>
-          <w:color w:val="000000"/>
-        </w:rPr>
-        <w:t>The higher the level of the enchant the more</w:t>
-      </w:r>
-      <w:r>
-        <w:rPr>
-          <w:rFonts w:ascii="ALAGARD" w:hAnsi="ALAGARD" w:cs="Calibri"/>
-        </w:rPr>
-        <w:t xml:space="preserve"> </w:t>
-      </w:r>
-      <w:r>
-        <w:rPr>
-          <w:rFonts w:ascii="ALAGARD" w:hAnsi="ALAGARD" w:cs="Calibri"/>
-          <w:color w:val="000000"/>
-        </w:rPr>
-        <w:t xml:space="preserve">mana you </w:t>
-      </w:r>
-      <w:r>
-        <w:rPr>
-          <w:rFonts w:ascii="ALAGARD" w:hAnsi="ALAGARD" w:cs="Calibri"/>
-          <w:color w:val="000000"/>
-        </w:rPr>
-        <w:t>must</w:t>
-      </w:r>
-      <w:r>
-        <w:rPr>
-          <w:rFonts w:ascii="ALAGARD" w:hAnsi="ALAGARD" w:cs="Calibri"/>
-          <w:color w:val="000000"/>
-        </w:rPr>
-        <w:t xml:space="preserve"> use. Ability enchants cost the</w:t>
-      </w:r>
-      <w:r>
-        <w:rPr>
-          <w:rFonts w:ascii="ALAGARD" w:hAnsi="ALAGARD" w:cs="Calibri"/>
-        </w:rPr>
-        <w:t xml:space="preserve"> </w:t>
-      </w:r>
-      <w:r>
-        <w:rPr>
-          <w:rFonts w:ascii="ALAGARD" w:hAnsi="ALAGARD" w:cs="Calibri"/>
-          <w:color w:val="000000"/>
-        </w:rPr>
-        <w:t>most and you can unlock to enchant spells and</w:t>
-      </w:r>
-      <w:r>
-        <w:rPr>
-          <w:rFonts w:ascii="Cambria" w:hAnsi="Cambria" w:cs="Cambria"/>
-          <w:color w:val="000000"/>
-        </w:rPr>
-        <w:t> </w:t>
-      </w:r>
-      <w:r>
-        <w:rPr>
-          <w:rFonts w:ascii="ALAGARD" w:hAnsi="ALAGARD" w:cs="Calibri"/>
-          <w:color w:val="000000"/>
-        </w:rPr>
-        <w:t>abilities you</w:t>
-      </w:r>
-      <w:r>
-        <w:rPr>
-          <w:rFonts w:ascii="Cambria" w:hAnsi="Cambria" w:cs="Cambria"/>
-          <w:color w:val="000000"/>
-        </w:rPr>
-        <w:t> </w:t>
-      </w:r>
-      <w:r>
-        <w:rPr>
-          <w:rFonts w:ascii="ALAGARD" w:hAnsi="ALAGARD" w:cs="Calibri"/>
-          <w:color w:val="000000"/>
-        </w:rPr>
-        <w:t>already know to your weapon or</w:t>
-      </w:r>
-      <w:r>
-        <w:rPr>
-          <w:rFonts w:ascii="Cambria" w:hAnsi="Cambria" w:cs="Cambria"/>
-          <w:color w:val="000000"/>
-        </w:rPr>
-        <w:t> </w:t>
-      </w:r>
-      <w:r>
-        <w:rPr>
-          <w:rFonts w:ascii="ALAGARD" w:hAnsi="ALAGARD" w:cs="Calibri"/>
-          <w:color w:val="000000"/>
-        </w:rPr>
-        <w:t>from a list of abilities you can learn in the skill tree.</w:t>
-      </w:r>
-    </w:p>
-    <w:p>
-      <w:pPr>
-        <w:shd w:val="clear" w:color="auto" w:fill="FFFFFF"/>
-        <w:rPr>
-          <w:rFonts w:ascii="ALAGARD" w:hAnsi="ALAGARD" w:cs="Calibri"/>
-          <w:color w:val="000000"/>
-        </w:rPr>
-      </w:pPr>
-    </w:p>
-    <w:p>
-      <w:pPr>
-        <w:shd w:val="clear" w:color="auto" w:fill="FFFFFF"/>
-        <w:rPr>
-          <w:rFonts w:ascii="ALAGARD" w:hAnsi="ALAGARD" w:cs="Calibri"/>
-          <w:color w:val="000000"/>
-        </w:rPr>
-      </w:pPr>
-      <w:r>
-        <w:rPr>
-          <w:rFonts w:ascii="ALAGARD" w:hAnsi="ALAGARD" w:cs="Calibri"/>
-          <w:color w:val="000000"/>
-        </w:rPr>
-        <w:t>- close range</w:t>
-      </w:r>
-    </w:p>
-    <w:p>
-      <w:pPr>
-        <w:shd w:val="clear" w:color="auto" w:fill="FFFFFF"/>
-        <w:rPr>
-          <w:rFonts w:ascii="ALAGARD" w:hAnsi="ALAGARD" w:cs="Calibri"/>
-          <w:color w:val="000000"/>
-        </w:rPr>
-      </w:pPr>
-      <w:r>
-        <w:rPr>
-          <w:rFonts w:ascii="ALAGARD" w:hAnsi="ALAGARD" w:cs="Calibri"/>
-          <w:color w:val="000000"/>
-        </w:rPr>
-        <w:t>- uses a lot of mana</w:t>
-      </w:r>
-    </w:p>
-    <w:p>
-      <w:pPr>
-        <w:rPr>
-          <w:rFonts w:ascii="ALAGARD" w:hAnsi="ALAGARD" w:cs="Calibri"/>
-        </w:rPr>
-      </w:pPr>
-    </w:p>
-    <w:p>
-      <w:pPr>
-        <w:rPr>
-          <w:rFonts w:ascii="ALAGARD" w:hAnsi="ALAGARD" w:cs="Calibri"/>
-          <w:sz w:val="32"/>
-          <w:szCs w:val="32"/>
-        </w:rPr>
-      </w:pPr>
-      <w:r>
-        <w:rPr>
-          <w:rFonts w:ascii="ALAGARD" w:hAnsi="ALAGARD" w:cs="Calibri"/>
-          <w:sz w:val="32"/>
-          <w:szCs w:val="32"/>
-        </w:rPr>
-        <w:t>Artificer</w:t>
-      </w:r>
-      <w:r>
-        <w:rPr>
-          <w:rFonts w:ascii="ALAGARD" w:hAnsi="ALAGARD" w:cs="Calibri"/>
-          <w:sz w:val="32"/>
-          <w:szCs w:val="32"/>
-        </w:rPr>
-        <w:t xml:space="preserve"> Tree</w:t>
-      </w:r>
-    </w:p>
-    <w:p>
-      <w:pPr>
-        <w:rPr>
-          <w:rFonts w:ascii="ALAGARD" w:hAnsi="ALAGARD" w:cs="Calibri"/>
-        </w:rPr>
-      </w:pPr>
-    </w:p>
-    <w:p>
-      <w:pPr>
-        <w:rPr>
-          <w:rFonts w:ascii="ALAGARD" w:hAnsi="ALAGARD" w:cs="Calibri"/>
-        </w:rPr>
-      </w:pPr>
-      <w:r>
-        <w:rPr>
-          <w:rFonts w:ascii="ALAGARD" w:hAnsi="ALAGARD" w:cs="Calibri"/>
-        </w:rPr>
-        <w:t>Conjurer</w:t>
-      </w:r>
-      <w:r>
-        <w:rPr>
-          <w:rFonts w:ascii="ALAGARD" w:hAnsi="ALAGARD" w:cs="Calibri"/>
-        </w:rPr>
-        <w:t>:</w:t>
+        <w:t>Artificer Tree</w:t>
+      </w:r>
+    </w:p>
+    <w:p>
+      <w:pPr>
+        <w:rPr>
+          <w:rFonts w:ascii="ALAGARD" w:hAnsi="ALAGARD" w:cs="Calibri"/>
+        </w:rPr>
+      </w:pPr>
+    </w:p>
+    <w:p>
+      <w:pPr>
+        <w:rPr>
+          <w:rFonts w:ascii="ALAGARD" w:hAnsi="ALAGARD" w:cs="Calibri"/>
+        </w:rPr>
+      </w:pPr>
+      <w:r>
+        <w:rPr>
+          <w:rFonts w:ascii="ALAGARD" w:hAnsi="ALAGARD" w:cs="Calibri"/>
+        </w:rPr>
+        <w:t>Conjurer:</w:t>
       </w:r>
     </w:p>
     <w:p>
@@ -2246,183 +2140,155 @@
           <w:sz w:val="32"/>
           <w:szCs w:val="32"/>
         </w:rPr>
-        <w:t>Warrior</w:t>
-      </w:r>
-      <w:r>
+        <w:t>Warrior Tree</w:t>
+      </w:r>
+    </w:p>
+    <w:p>
+      <w:pPr>
+        <w:rPr>
+          <w:rFonts w:ascii="ALAGARD" w:hAnsi="ALAGARD" w:cs="Calibri"/>
+        </w:rPr>
+      </w:pPr>
+    </w:p>
+    <w:p>
+      <w:pPr>
+        <w:rPr>
+          <w:rFonts w:ascii="ALAGARD" w:hAnsi="ALAGARD" w:cs="Calibri"/>
+        </w:rPr>
+      </w:pPr>
+      <w:r>
+        <w:rPr>
+          <w:rFonts w:ascii="ALAGARD" w:hAnsi="ALAGARD" w:cs="Calibri"/>
+        </w:rPr>
+        <w:t>Berserker</w:t>
+      </w:r>
+      <w:r>
+        <w:rPr>
+          <w:rFonts w:ascii="ALAGARD" w:hAnsi="ALAGARD" w:cs="Calibri"/>
+        </w:rPr>
+        <w:t>:</w:t>
+      </w:r>
+    </w:p>
+    <w:p>
+      <w:pPr>
+        <w:rPr>
+          <w:rFonts w:ascii="ALAGARD" w:hAnsi="ALAGARD" w:cs="Calibri"/>
+        </w:rPr>
+      </w:pPr>
+      <w:r>
+        <w:rPr>
+          <w:rFonts w:ascii="ALAGARD" w:hAnsi="ALAGARD" w:cs="Calibri"/>
+        </w:rPr>
+        <w:t>Fortress</w:t>
+      </w:r>
+      <w:r>
+        <w:rPr>
+          <w:rFonts w:ascii="ALAGARD" w:hAnsi="ALAGARD" w:cs="Calibri"/>
+        </w:rPr>
+        <w:t>:</w:t>
+      </w:r>
+    </w:p>
+    <w:p>
+      <w:pPr>
+        <w:rPr>
+          <w:rFonts w:ascii="ALAGARD" w:hAnsi="ALAGARD" w:cs="Calibri"/>
+        </w:rPr>
+      </w:pPr>
+    </w:p>
+    <w:p>
+      <w:pPr>
         <w:rPr>
           <w:rFonts w:ascii="ALAGARD" w:hAnsi="ALAGARD" w:cs="Calibri"/>
           <w:sz w:val="32"/>
           <w:szCs w:val="32"/>
         </w:rPr>
-        <w:t xml:space="preserve"> Tree</w:t>
-      </w:r>
-    </w:p>
-    <w:p>
-      <w:pPr>
-        <w:rPr>
-          <w:rFonts w:ascii="ALAGARD" w:hAnsi="ALAGARD" w:cs="Calibri"/>
-        </w:rPr>
-      </w:pPr>
-    </w:p>
-    <w:p>
-      <w:pPr>
-        <w:rPr>
-          <w:rFonts w:ascii="ALAGARD" w:hAnsi="ALAGARD" w:cs="Calibri"/>
-        </w:rPr>
-      </w:pPr>
-      <w:r>
-        <w:rPr>
-          <w:rFonts w:ascii="ALAGARD" w:hAnsi="ALAGARD" w:cs="Calibri"/>
-        </w:rPr>
-        <w:t>Berserker</w:t>
-      </w:r>
-      <w:r>
-        <w:rPr>
-          <w:rFonts w:ascii="ALAGARD" w:hAnsi="ALAGARD" w:cs="Calibri"/>
-        </w:rPr>
-        <w:t>:</w:t>
-      </w:r>
-    </w:p>
-    <w:p>
-      <w:pPr>
-        <w:rPr>
-          <w:rFonts w:ascii="ALAGARD" w:hAnsi="ALAGARD" w:cs="Calibri"/>
-        </w:rPr>
-      </w:pPr>
-      <w:r>
-        <w:rPr>
-          <w:rFonts w:ascii="ALAGARD" w:hAnsi="ALAGARD" w:cs="Calibri"/>
-        </w:rPr>
-        <w:t>Fortress</w:t>
-      </w:r>
-      <w:r>
-        <w:rPr>
-          <w:rFonts w:ascii="ALAGARD" w:hAnsi="ALAGARD" w:cs="Calibri"/>
-        </w:rPr>
-        <w:t>:</w:t>
-      </w:r>
-    </w:p>
-    <w:p>
-      <w:pPr>
-        <w:rPr>
-          <w:rFonts w:ascii="ALAGARD" w:hAnsi="ALAGARD" w:cs="Calibri"/>
-        </w:rPr>
-      </w:pPr>
-    </w:p>
-    <w:p>
-      <w:pPr>
+      </w:pPr>
+      <w:r>
         <w:rPr>
           <w:rFonts w:ascii="ALAGARD" w:hAnsi="ALAGARD" w:cs="Calibri"/>
           <w:sz w:val="32"/>
           <w:szCs w:val="32"/>
         </w:rPr>
-      </w:pPr>
-      <w:r>
+        <w:t>Swordsman Tree</w:t>
+      </w:r>
+    </w:p>
+    <w:p>
+      <w:pPr>
+        <w:rPr>
+          <w:rFonts w:ascii="ALAGARD" w:hAnsi="ALAGARD" w:cs="Calibri"/>
+        </w:rPr>
+      </w:pPr>
+    </w:p>
+    <w:p>
+      <w:pPr>
+        <w:rPr>
+          <w:rFonts w:ascii="ALAGARD" w:hAnsi="ALAGARD" w:cs="Calibri"/>
+        </w:rPr>
+      </w:pPr>
+      <w:proofErr w:type="spellStart"/>
+      <w:r>
+        <w:rPr>
+          <w:rFonts w:ascii="ALAGARD" w:hAnsi="ALAGARD" w:cs="Calibri"/>
+        </w:rPr>
+        <w:t>Assasin</w:t>
+      </w:r>
+      <w:proofErr w:type="spellEnd"/>
+      <w:r>
+        <w:rPr>
+          <w:rFonts w:ascii="ALAGARD" w:hAnsi="ALAGARD" w:cs="Calibri"/>
+        </w:rPr>
+        <w:t>:</w:t>
+      </w:r>
+    </w:p>
+    <w:p>
+      <w:pPr>
+        <w:rPr>
+          <w:rFonts w:ascii="ALAGARD" w:hAnsi="ALAGARD" w:cs="Calibri"/>
+        </w:rPr>
+      </w:pPr>
+      <w:r>
+        <w:rPr>
+          <w:rFonts w:ascii="ALAGARD" w:hAnsi="ALAGARD" w:cs="Calibri"/>
+        </w:rPr>
+        <w:t>Knight:</w:t>
+      </w:r>
+    </w:p>
+    <w:p>
+      <w:pPr>
+        <w:rPr>
+          <w:rFonts w:ascii="ALAGARD" w:hAnsi="ALAGARD" w:cs="Calibri"/>
+        </w:rPr>
+      </w:pPr>
+      <w:r>
+        <w:rPr>
+          <w:rFonts w:ascii="ALAGARD" w:hAnsi="ALAGARD" w:cs="Calibri"/>
+        </w:rPr>
+        <w:t>Samurai:</w:t>
+      </w:r>
+    </w:p>
+    <w:p>
+      <w:pPr>
+        <w:rPr>
+          <w:rFonts w:ascii="ALAGARD" w:hAnsi="ALAGARD" w:cs="Calibri"/>
+        </w:rPr>
+      </w:pPr>
+    </w:p>
+    <w:p>
+      <w:pPr>
         <w:rPr>
           <w:rFonts w:ascii="ALAGARD" w:hAnsi="ALAGARD" w:cs="Calibri"/>
           <w:sz w:val="32"/>
           <w:szCs w:val="32"/>
         </w:rPr>
-        <w:t>Swordsman Tree</w:t>
-      </w:r>
-    </w:p>
-    <w:p>
-      <w:pPr>
-        <w:rPr>
-          <w:rFonts w:ascii="ALAGARD" w:hAnsi="ALAGARD" w:cs="Calibri"/>
-        </w:rPr>
-      </w:pPr>
-    </w:p>
-    <w:p>
-      <w:pPr>
-        <w:rPr>
-          <w:rFonts w:ascii="ALAGARD" w:hAnsi="ALAGARD" w:cs="Calibri"/>
-        </w:rPr>
-      </w:pPr>
-      <w:proofErr w:type="spellStart"/>
-      <w:r>
-        <w:rPr>
-          <w:rFonts w:ascii="ALAGARD" w:hAnsi="ALAGARD" w:cs="Calibri"/>
-        </w:rPr>
-        <w:t>Assasin</w:t>
-      </w:r>
-      <w:proofErr w:type="spellEnd"/>
-      <w:r>
-        <w:rPr>
-          <w:rFonts w:ascii="ALAGARD" w:hAnsi="ALAGARD" w:cs="Calibri"/>
-        </w:rPr>
-        <w:t>:</w:t>
-      </w:r>
-    </w:p>
-    <w:p>
-      <w:pPr>
-        <w:rPr>
-          <w:rFonts w:ascii="ALAGARD" w:hAnsi="ALAGARD" w:cs="Calibri"/>
-        </w:rPr>
-      </w:pPr>
-      <w:r>
-        <w:rPr>
-          <w:rFonts w:ascii="ALAGARD" w:hAnsi="ALAGARD" w:cs="Calibri"/>
-        </w:rPr>
-        <w:t>Knight</w:t>
-      </w:r>
-      <w:r>
-        <w:rPr>
-          <w:rFonts w:ascii="ALAGARD" w:hAnsi="ALAGARD" w:cs="Calibri"/>
-        </w:rPr>
-        <w:t>:</w:t>
-      </w:r>
-    </w:p>
-    <w:p>
-      <w:pPr>
-        <w:rPr>
-          <w:rFonts w:ascii="ALAGARD" w:hAnsi="ALAGARD" w:cs="Calibri"/>
-        </w:rPr>
-      </w:pPr>
-      <w:r>
-        <w:rPr>
-          <w:rFonts w:ascii="ALAGARD" w:hAnsi="ALAGARD" w:cs="Calibri"/>
-        </w:rPr>
-        <w:t>Samurai</w:t>
-      </w:r>
-      <w:r>
-        <w:rPr>
-          <w:rFonts w:ascii="ALAGARD" w:hAnsi="ALAGARD" w:cs="Calibri"/>
-        </w:rPr>
-        <w:t>:</w:t>
-      </w:r>
-    </w:p>
-    <w:p>
-      <w:pPr>
-        <w:rPr>
-          <w:rFonts w:ascii="ALAGARD" w:hAnsi="ALAGARD" w:cs="Calibri"/>
-        </w:rPr>
-      </w:pPr>
-    </w:p>
-    <w:p>
-      <w:pPr>
+      </w:pPr>
+      <w:r>
         <w:rPr>
           <w:rFonts w:ascii="ALAGARD" w:hAnsi="ALAGARD" w:cs="Calibri"/>
           <w:sz w:val="32"/>
           <w:szCs w:val="32"/>
         </w:rPr>
-      </w:pPr>
-      <w:r>
-        <w:rPr>
-          <w:rFonts w:ascii="ALAGARD" w:hAnsi="ALAGARD" w:cs="Calibri"/>
-          <w:sz w:val="32"/>
-          <w:szCs w:val="32"/>
-        </w:rPr>
         <w:lastRenderedPageBreak/>
-        <w:t>Saint</w:t>
-      </w:r>
-      <w:r>
-        <w:rPr>
-          <w:rFonts w:ascii="ALAGARD" w:hAnsi="ALAGARD" w:cs="Calibri"/>
-          <w:sz w:val="32"/>
-          <w:szCs w:val="32"/>
-        </w:rPr>
-        <w:t xml:space="preserve"> Tree</w:t>
+        <w:t>Saint Tree</w:t>
       </w:r>
     </w:p>
     <w:p>

</xml_diff>